<commit_message>
Aplica S06 (diagrama de contexto DFD) y Sesion 14 (categorias de arquitectura)
- Figura 5 redibujada al estilo DFD clasico: proceso unico central,
  entidades externas y flujos de datos etiquetados (S06)
- Seccion 3.2 con terminologia de S06 (proceso unico, entidades
  externas, flujos de datos)
- Se anade la categoria de arquitectura de negocio (Estrada Hernandez)
  como base de las 4 categorias de la Sesion 14
- Material nuevo: S06_s1 y PPT Sesion 14
</commit_message>
<xml_diff>
--- a/Avance1/Avance1_Fogon_Andino.docx
+++ b/Avance1/Avance1_Fogon_Andino.docx
@@ -2240,6 +2240,20 @@
       </w:r>
     </w:p>
     <w:p>
+      <w:pPr>
+        <w:spacing w:line="480" w:lineRule="auto"/>
+        <w:ind w:firstLine="720"/>
+        <w:jc w:val="left"/>
+      </w:pPr>
+      <w:r>
+        <w:rPr>
+          <w:rFonts w:ascii="Times New Roman" w:hAnsi="Times New Roman"/>
+          <w:sz w:val="24"/>
+        </w:rPr>
+        <w:t>El modelado del negocio desarrollado en este avance corresponde a la categoría de arquitectura de negocio, una de las cuatro categorías en las que se estructura la arquitectura empresarial junto con la arquitectura de datos, de aplicaciones y tecnológica (Estrada Hernández, s.f.). Esta categoría se basa en definir los planes del negocio, la organización de los procesos del negocio y la gobernanza, y se modela mediante casos de uso del negocio, diagramas de actividades, objetos y clases del negocio y el modelo del dominio, que son precisamente los artefactos elaborados en el presente informe. De este modo, el avance sienta las bases para que, en la siguiente unidad, las categorías de datos, aplicaciones y tecnológica se construyan sobre los requerimientos aquí especificados.</w:t>
+      </w:r>
+    </w:p>
+    <w:p>
       <w:r>
         <w:br w:type="page"/>
       </w:r>
@@ -2328,7 +2342,21 @@
           <w:rFonts w:ascii="Times New Roman" w:hAnsi="Times New Roman"/>
           <w:sz w:val="24"/>
         </w:rPr>
-        <w:t>El diagrama de contexto es una vista de alto nivel que permite delimitar el sistema y sus interacciones con los actores externos, mostrando el flujo de información entre el sistema y su entorno. En la Figura 5 se observa que el sistema central se comunica con seis tipos de usuarios (cliente, mozo, chef, cajero, repartidor y administrador) y con dos sistemas externos: la pasarela de pago, encargada de validar y registrar los pagos electrónicos, y el portal de proveedores, que recibe las órdenes de compra de insumos.</w:t>
+        <w:t>El diagrama de contexto es una representación gráfica de alto nivel que permite visualizar el sistema como una única entidad y mostrar su relación con los elementos externos que interactúan con él. El sistema completo se representa como un solo proceso, sin mostrar sus procesos internos, mientras que las personas, programas u organizaciones que interactúan con él se representan como entidades externas, ubicadas más allá de las fronteras del sistema. Los movimientos de información entre ambos se denominan flujos de datos.</w:t>
+      </w:r>
+    </w:p>
+    <w:p>
+      <w:pPr>
+        <w:spacing w:line="480" w:lineRule="auto"/>
+        <w:ind w:firstLine="720"/>
+        <w:jc w:val="left"/>
+      </w:pPr>
+      <w:r>
+        <w:rPr>
+          <w:rFonts w:ascii="Times New Roman" w:hAnsi="Times New Roman"/>
+          <w:sz w:val="24"/>
+        </w:rPr>
+        <w:t>Este diagrama resulta especialmente importante porque permite establecer una visión inicial del sistema antes de analizar sus funcionalidades internas: identifica a los actores y entidades externas, determina los principales flujos de información, delimita el alcance del sistema y sirve como punto de partida para el análisis detallado de requerimientos. En la Figura 5 se observa que el sistema de gestión de pedidos se comunica con seis tipos de usuarios (cliente, mozo, chef, cajero, repartidor y administrador) y con dos sistemas externos: la pasarela de pago, encargada de validar y registrar los pagos electrónicos, y los proveedores, que reciben las órdenes de compra de insumos.</w:t>
       </w:r>
     </w:p>
     <w:p>
@@ -2369,7 +2397,7 @@
       <w:r>
         <w:drawing>
           <wp:inline xmlns:a="http://schemas.openxmlformats.org/drawingml/2006/main" xmlns:pic="http://schemas.openxmlformats.org/drawingml/2006/picture">
-            <wp:extent cx="5580000" cy="3705708"/>
+            <wp:extent cx="5580000" cy="3787883"/>
             <wp:docPr id="5" name="Picture 5"/>
             <wp:cNvGraphicFramePr>
               <a:graphicFrameLocks noChangeAspect="1"/>
@@ -2390,7 +2418,7 @@
                   <pic:spPr>
                     <a:xfrm>
                       <a:off x="0" y="0"/>
-                      <a:ext cx="5580000" cy="3705708"/>
+                      <a:ext cx="5580000" cy="3787883"/>
                     </a:xfrm>
                     <a:prstGeom prst="rect"/>
                   </pic:spPr>
@@ -5387,7 +5415,7 @@
           <w:rFonts w:ascii="Times New Roman" w:hAnsi="Times New Roman"/>
           <w:sz w:val="24"/>
         </w:rPr>
-        <w:t>Se concluye que el modelado del negocio permitió comprender la organización antes de automatizarla, tal como lo plantea Sommerville (2011), y que la trazabilidad establecida entre las necesidades del negocio, los requerimientos funcionales, los casos de uso y los componentes del sistema constituye una práctica fundamental de la gestión de requerimientos (CMMI Institute, 2023). Esta documentación servirá como insumo directo para la fase de arquitectura empresarial basada en TOGAF, que se desarrollará en la siguiente unidad del curso, pues define de manera clara qué procesos y funcionalidades deberán ser soportados por la arquitectura futura de la organización.</w:t>
+        <w:t>Se concluye que el modelado del negocio permitió comprender la organización antes de automatizarla, tal como lo plantea Sommerville (2011), y que la trazabilidad establecida entre las necesidades del negocio, los requerimientos funcionales, los casos de uso y los componentes del sistema constituye una práctica fundamental de la gestión de requerimientos (CMMI Institute, 2023). Asimismo, los artefactos elaborados —casos de uso del negocio, diagramas de actividades y modelo de dominio— corresponden a la categoría de arquitectura de negocio, base sobre la cual se construirán las arquitecturas de datos, de aplicaciones y tecnológica (Estrada Hernández, s.f.). Esta documentación servirá como insumo directo para la fase de arquitectura empresarial basada en TOGAF, que se desarrollará en la siguiente unidad del curso, pues define de manera clara qué procesos y funcionalidades deberán ser soportados por la arquitectura futura de la organización.</w:t>
       </w:r>
     </w:p>
     <w:p>
@@ -5464,6 +5492,20 @@
           <w:sz w:val="24"/>
         </w:rPr>
         <w:t>CMMI Institute. (2023). CMMI V3.0: Capability Maturity Model Integration. ISACA.</w:t>
+      </w:r>
+    </w:p>
+    <w:p>
+      <w:pPr>
+        <w:spacing w:line="480" w:lineRule="auto"/>
+        <w:ind w:left="720" w:hanging="720"/>
+        <w:jc w:val="left"/>
+      </w:pPr>
+      <w:r>
+        <w:rPr>
+          <w:rFonts w:ascii="Times New Roman" w:hAnsi="Times New Roman"/>
+          <w:sz w:val="24"/>
+        </w:rPr>
+        <w:t>Estrada Hernández, J. A. (s.f.). Modelo para la gestión de tecnología de información y comunicación en la gestión empresarial. Editorial Universitaria.</w:t>
       </w:r>
     </w:p>
     <w:p>

</xml_diff>